<commit_message>
chore(1.2.1-dev): regenerate CLAUDE doc twins before 1.2.X QA rebuild (operator commit-everything directive 2026-07-27)
Co-Authored-By: Claude Opus 4.8 <noreply@anthropic.com>
</commit_message>
<xml_diff>
--- a/CLAUDE.docx
+++ b/CLAUDE.docx
@@ -17426,10 +17426,10 @@
   <w:docDefaults>
     <w:rPrDefault>
       <w:rPr>
-        <w:rFonts w:asciiTheme="minorHAnsi" w:cstheme="minorBidi" w:eastAsiaTheme="minorHAnsi" w:hAnsiTheme="minorHAnsi"/>
+        <w:rFonts w:asciiTheme="minorHAnsi" w:cstheme="minorBidi" w:eastAsiaTheme="minorEastAsia" w:hAnsiTheme="minorHAnsi"/>
         <w:sz w:val="24"/>
         <w:szCs w:val="24"/>
-        <w:lang w:bidi="ar-SA" w:eastAsia="en-US" w:val="en"/>
+        <w:lang w:bidi="ar-SA" w:eastAsia="zh-CN" w:val="en"/>
       </w:rPr>
     </w:rPrDefault>
     <w:pPrDefault>
@@ -17970,13 +17970,6 @@
       </w:tblCellMar>
     </w:tblPr>
     <w:tblStylePr w:type="firstRow">
-      <w:tblPr>
-        <w:jc w:val="left"/>
-        <w:tblInd w:type="dxa" w:w="0"/>
-      </w:tblPr>
-      <w:trPr>
-        <w:jc w:val="left"/>
-      </w:trPr>
       <w:tcPr>
         <w:tcBorders>
           <w:bottom w:val="single"/>

</xml_diff>